<commit_message>
Atualiza o Manual Faça Você Mesmo à ACL vigente, com Secretaria no lugar de Líder, Líder Geral, Administrador de Eventos e Orquestrador.
Co-authored-by: Cursor <cursoragent@cursor.com>
</commit_message>
<xml_diff>
--- a/docs/MANUAL_OPERACAO_CONECTA_FACA_VOCE_MESMO.docx
+++ b/docs/MANUAL_OPERACAO_CONECTA_FACA_VOCE_MESMO.docx
@@ -66,7 +66,7 @@
           <w:color w:val="4A5568"/>
           <w:sz w:val="24"/>
         </w:rPr>
-        <w:t>Documento gerado a partir do código-fonte publicado (menus, rotas e ACL).</w:t>
+        <w:t>Documento gerado a partir do código-fonte publicado (menus, rotas e ACL). Papéis Líder, Líder Geral, Administrador de Eventos e Orquestrador de Evento foram absorvidos pela Secretaria e não existem mais.</w:t>
       </w:r>
     </w:p>
     <w:p>
@@ -623,206 +623,6 @@
                 <w:i w:val="0"/>
                 <w:sz w:val="20"/>
               </w:rPr>
-              <w:t>Líder</w:t>
-            </w:r>
-          </w:p>
-        </w:tc>
-        <w:tc>
-          <w:tcPr>
-            <w:tcW w:type="dxa" w:w="3213"/>
-          </w:tcPr>
-          <w:p>
-            <w:r>
-              <w:rPr>
-                <w:rFonts w:ascii="Calibri" w:hAnsi="Calibri" w:eastAsia="Calibri"/>
-                <w:b w:val="0"/>
-                <w:i w:val="0"/>
-                <w:sz w:val="20"/>
-              </w:rPr>
-              <w:t>lider</w:t>
-            </w:r>
-          </w:p>
-        </w:tc>
-        <w:tc>
-          <w:tcPr>
-            <w:tcW w:type="dxa" w:w="3213"/>
-          </w:tcPr>
-          <w:p>
-            <w:r>
-              <w:rPr>
-                <w:rFonts w:ascii="Calibri" w:hAnsi="Calibri" w:eastAsia="Calibri"/>
-                <w:b w:val="0"/>
-                <w:i w:val="0"/>
-                <w:sz w:val="20"/>
-              </w:rPr>
-              <w:t>Escalas dos tipos em que lidera; operação de culto conforme grants.</w:t>
-            </w:r>
-          </w:p>
-        </w:tc>
-      </w:tr>
-      <w:tr>
-        <w:tc>
-          <w:tcPr>
-            <w:tcW w:type="dxa" w:w="3213"/>
-          </w:tcPr>
-          <w:p>
-            <w:r>
-              <w:rPr>
-                <w:rFonts w:ascii="Calibri" w:hAnsi="Calibri" w:eastAsia="Calibri"/>
-                <w:b w:val="0"/>
-                <w:i w:val="0"/>
-                <w:sz w:val="20"/>
-              </w:rPr>
-              <w:t>Líder Geral</w:t>
-            </w:r>
-          </w:p>
-        </w:tc>
-        <w:tc>
-          <w:tcPr>
-            <w:tcW w:type="dxa" w:w="3213"/>
-          </w:tcPr>
-          <w:p>
-            <w:r>
-              <w:rPr>
-                <w:rFonts w:ascii="Calibri" w:hAnsi="Calibri" w:eastAsia="Calibri"/>
-                <w:b w:val="0"/>
-                <w:i w:val="0"/>
-                <w:sz w:val="20"/>
-              </w:rPr>
-              <w:t>lider_geral</w:t>
-            </w:r>
-          </w:p>
-        </w:tc>
-        <w:tc>
-          <w:tcPr>
-            <w:tcW w:type="dxa" w:w="3213"/>
-          </w:tcPr>
-          <w:p>
-            <w:r>
-              <w:rPr>
-                <w:rFonts w:ascii="Calibri" w:hAnsi="Calibri" w:eastAsia="Calibri"/>
-                <w:b w:val="0"/>
-                <w:i w:val="0"/>
-                <w:sz w:val="20"/>
-              </w:rPr>
-              <w:t>Escalas de todos os tipos ativos; visão mais ampla de pessoas.</w:t>
-            </w:r>
-          </w:p>
-        </w:tc>
-      </w:tr>
-      <w:tr>
-        <w:tc>
-          <w:tcPr>
-            <w:tcW w:type="dxa" w:w="3213"/>
-          </w:tcPr>
-          <w:p>
-            <w:r>
-              <w:rPr>
-                <w:rFonts w:ascii="Calibri" w:hAnsi="Calibri" w:eastAsia="Calibri"/>
-                <w:b w:val="0"/>
-                <w:i w:val="0"/>
-                <w:sz w:val="20"/>
-              </w:rPr>
-              <w:t>Administrador de eventos</w:t>
-            </w:r>
-          </w:p>
-        </w:tc>
-        <w:tc>
-          <w:tcPr>
-            <w:tcW w:type="dxa" w:w="3213"/>
-          </w:tcPr>
-          <w:p>
-            <w:r>
-              <w:rPr>
-                <w:rFonts w:ascii="Calibri" w:hAnsi="Calibri" w:eastAsia="Calibri"/>
-                <w:b w:val="0"/>
-                <w:i w:val="0"/>
-                <w:sz w:val="20"/>
-              </w:rPr>
-              <w:t>events_admin</w:t>
-            </w:r>
-          </w:p>
-        </w:tc>
-        <w:tc>
-          <w:tcPr>
-            <w:tcW w:type="dxa" w:w="3213"/>
-          </w:tcPr>
-          <w:p>
-            <w:r>
-              <w:rPr>
-                <w:rFonts w:ascii="Calibri" w:hAnsi="Calibri" w:eastAsia="Calibri"/>
-                <w:b w:val="0"/>
-                <w:i w:val="0"/>
-                <w:sz w:val="20"/>
-              </w:rPr>
-              <w:t>Salas, totem, operação de culto (conforme grants da instância).</w:t>
-            </w:r>
-          </w:p>
-        </w:tc>
-      </w:tr>
-      <w:tr>
-        <w:tc>
-          <w:tcPr>
-            <w:tcW w:type="dxa" w:w="3213"/>
-          </w:tcPr>
-          <w:p>
-            <w:r>
-              <w:rPr>
-                <w:rFonts w:ascii="Calibri" w:hAnsi="Calibri" w:eastAsia="Calibri"/>
-                <w:b w:val="0"/>
-                <w:i w:val="0"/>
-                <w:sz w:val="20"/>
-              </w:rPr>
-              <w:t>Orquestrador de Evento</w:t>
-            </w:r>
-          </w:p>
-        </w:tc>
-        <w:tc>
-          <w:tcPr>
-            <w:tcW w:type="dxa" w:w="3213"/>
-          </w:tcPr>
-          <w:p>
-            <w:r>
-              <w:rPr>
-                <w:rFonts w:ascii="Calibri" w:hAnsi="Calibri" w:eastAsia="Calibri"/>
-                <w:b w:val="0"/>
-                <w:i w:val="0"/>
-                <w:sz w:val="20"/>
-              </w:rPr>
-              <w:t>orquestrador_evento</w:t>
-            </w:r>
-          </w:p>
-        </w:tc>
-        <w:tc>
-          <w:tcPr>
-            <w:tcW w:type="dxa" w:w="3213"/>
-          </w:tcPr>
-          <w:p>
-            <w:r>
-              <w:rPr>
-                <w:rFonts w:ascii="Calibri" w:hAnsi="Calibri" w:eastAsia="Calibri"/>
-                <w:b w:val="0"/>
-                <w:i w:val="0"/>
-                <w:sz w:val="20"/>
-              </w:rPr>
-              <w:t>Painel em tela cheia dos avisos do culto em andamento.</w:t>
-            </w:r>
-          </w:p>
-        </w:tc>
-      </w:tr>
-      <w:tr>
-        <w:tc>
-          <w:tcPr>
-            <w:tcW w:type="dxa" w:w="3213"/>
-          </w:tcPr>
-          <w:p>
-            <w:r>
-              <w:rPr>
-                <w:rFonts w:ascii="Calibri" w:hAnsi="Calibri" w:eastAsia="Calibri"/>
-                <w:b w:val="0"/>
-                <w:i w:val="0"/>
-                <w:sz w:val="20"/>
-              </w:rPr>
               <w:t>Secretaria</w:t>
             </w:r>
           </w:p>
@@ -855,7 +655,7 @@
                 <w:i w:val="0"/>
                 <w:sz w:val="20"/>
               </w:rPr>
-              <w:t>Operação da igreja: eventos, escalas, salas, totem, células, recepção e avisos. Sem Cuidados Pastorais e sem finanças globais.</w:t>
+              <w:t>Operação da igreja: eventos, orquestração, escalas (todos os tipos), salas, totem, células, recepção, avisos, mídia, murais, campanhas e temas da Trilha. Sem Cuidados Pastorais nem tesouraria global.</w:t>
             </w:r>
           </w:p>
         </w:tc>
@@ -905,7 +705,7 @@
                 <w:i w:val="0"/>
                 <w:sz w:val="20"/>
               </w:rPr>
-              <w:t>Lançamentos, RD, orçamento, campanhas e modelo preditivo.</w:t>
+              <w:t>Lançamentos, RD, orçamento, modelo preditivo; também opera campanhas.</w:t>
             </w:r>
           </w:p>
         </w:tc>
@@ -1073,7 +873,7 @@
           <w:i w:val="0"/>
           <w:sz w:val="22"/>
         </w:rPr>
-        <w:t>Regras que atravessam o manual: (1) cada igreja (tenant) só enxerga os próprios dados; (2) alguns menus exigem vínculo ativo (membership_out vazio); (3) no Modo Ghost a identidade usada é a da pessoa auditada, não a do operador; (4) o Gestor não lista Super Administrador.</w:t>
+        <w:t>Regras que atravessam o manual: (1) cada igreja (tenant) só enxerga os próprios dados; (2) alguns menus exigem vínculo ativo (membership_out vazio); (3) no Modo Ghost a identidade usada é a da pessoa auditada, não a do operador; (4) o Gestor não lista Super Administrador; (5) não existem mais os papéis Líder, Líder Geral, Administrador de Eventos nem Orquestrador — a operação correspondente é da Secretaria.</w:t>
       </w:r>
     </w:p>
     <w:p>
@@ -2946,7 +2746,7 @@
           <w:i w:val="0"/>
           <w:sz w:val="22"/>
         </w:rPr>
-        <w:t>Secretaria, Líder, Gestor ou Super Admin em Engrenagem → Culto e Eventos → Programação de Eventos. Publicar o evento é o que o faz aparecer aqui.</w:t>
+        <w:t>Secretaria, Gestor ou Super Admin em Engrenagem → Culto e Eventos → Programação de Eventos. Publicar o evento é o que o faz aparecer aqui.</w:t>
       </w:r>
     </w:p>
     <w:p>
@@ -3260,7 +3060,7 @@
           <w:i w:val="0"/>
           <w:sz w:val="22"/>
         </w:rPr>
-        <w:t>Secretaria / Orquestrador: Engrenagem → Culto e Eventos → Manutenção de Avisos (comunicados). Outros avisos nascem dos respectivos módulos (vaga, troca, pedido pastoral).</w:t>
+        <w:t>Secretaria: Engrenagem → Culto e Eventos → Manutenção de Avisos (comunicados). Outros avisos nascem dos respectivos módulos (vaga, troca, pedido pastoral).</w:t>
       </w:r>
     </w:p>
     <w:p>
@@ -4302,7 +4102,7 @@
           <w:i w:val="0"/>
           <w:sz w:val="22"/>
         </w:rPr>
-        <w:t>Tesoureiro / Pastoral / Líder Geral / Super Admin em Engrenagem → Finanças → Gestão de Campanhas (criar, meta, datas, status).</w:t>
+        <w:t>Secretaria, Tesoureiro, Pastoral ou Super Admin em Engrenagem → Finanças → Gestão de Campanhas (criar, meta, datas, status).</w:t>
       </w:r>
     </w:p>
     <w:p>
@@ -6471,7 +6271,7 @@
           <w:i w:val="0"/>
           <w:sz w:val="22"/>
         </w:rPr>
-        <w:t>Equipe Pastoral / Líderes: Temas da Trilha. Super Admin: Resetar Trilha. Certificados: Reconhecimentos.</w:t>
+        <w:t>Secretaria e Equipe Pastoral: Temas da Trilha. Super Admin: Resetar Trilha. Certificados: Reconhecimentos.</w:t>
       </w:r>
     </w:p>
     <w:p>
@@ -7363,7 +7163,7 @@
           <w:i w:val="0"/>
           <w:sz w:val="22"/>
         </w:rPr>
-        <w:t>Secretaria / Pastoral / Líder Geral cadastram grupos em Gestão de Pequenos Grupos. O membro pede vaga; o anfitrião/líder recebe o fluxo.</w:t>
+        <w:t>Secretaria e Pastoral cadastram grupos em Gestão de Pequenos Grupos. O membro pede vaga; o anfitrião ou o líder da célula recebe o fluxo.</w:t>
       </w:r>
     </w:p>
     <w:p>
@@ -7677,7 +7477,7 @@
           <w:i w:val="0"/>
           <w:sz w:val="22"/>
         </w:rPr>
-        <w:t>Secretaria (tipos, servos, programação). Líder / Líder Geral programam os tipos que lideram. O membro só solicita troca.</w:t>
+        <w:t>Secretaria programa tipos, servos e datas (acesso a todas as escalas ativas). O membro só solicita troca.</w:t>
       </w:r>
     </w:p>
     <w:p>
@@ -8330,7 +8130,7 @@
           <w:i w:val="0"/>
           <w:sz w:val="22"/>
         </w:rPr>
-        <w:t>O membro publica (vai para moderação). Liderança aprova em Moderação do Mural. Super Admin / Pastoral / Líderes moderam.</w:t>
+        <w:t>O membro publica (vai para moderação). Secretaria, Pastoral ou Super Admin aprovam em Moderação do Mural.</w:t>
       </w:r>
     </w:p>
     <w:p>
@@ -9465,7 +9265,7 @@
           <w:i w:val="0"/>
           <w:sz w:val="22"/>
         </w:rPr>
-        <w:t>Quase todos os painéis exigem também a tela `/maintenance-dashboard` (view). Painéis internos abrem `/(maintenance-dashboard)?panel=CHAVE`. Ferramentas de operador (salas, totem, mídia, billing, igrejas) têm rota própria. Super Administrador vê tudo. Secretaria não vê Cuidados Pastorais, finanças globais, Controle de Acesso, Ghost, Autorização de mídia nem Assinaturas.</w:t>
+        <w:t>Quase todos os painéis exigem também a tela `/maintenance-dashboard` (view). Painéis internos abrem `/maintenance-dashboard?panel=CHAVE`. Ferramentas de operador (salas, totem, mídia, billing, igrejas) têm rota própria. Super Administrador vê tudo. Secretaria opera o culto e as pessoas, mas não vê Cuidados Pastorais, tesouraria global, Controle de Acesso, Ghost nem Assinaturas.</w:t>
       </w:r>
     </w:p>
     <w:p>
@@ -9549,7 +9349,7 @@
           <w:i w:val="0"/>
           <w:sz w:val="22"/>
         </w:rPr>
-        <w:t>Secretaria, Administrador de eventos, Líder, Líder Geral, Gestor, Super Admin.</w:t>
+        <w:t>Secretaria, Gestor, Super Admin.</w:t>
       </w:r>
     </w:p>
     <w:p>
@@ -9888,7 +9688,7 @@
           <w:i w:val="0"/>
           <w:sz w:val="22"/>
         </w:rPr>
-        <w:t>Secretaria e liderança com manutenção ou salas. O dispositivo do hall fica logado nesta tela o culto inteiro.</w:t>
+        <w:t>Secretaria e quem tiver manutenção ou salas. O dispositivo do hall fica logado nesta tela o culto inteiro.</w:t>
       </w:r>
     </w:p>
     <w:p>
@@ -10202,7 +10002,7 @@
           <w:i w:val="0"/>
           <w:sz w:val="22"/>
         </w:rPr>
-        <w:t>Super Admin, Equipe Pastoral, Líder, Líder Geral, Administrador de eventos. Secretaria NÃO vê este item.</w:t>
+        <w:t>Secretaria, Equipe Pastoral e Super Admin.</w:t>
       </w:r>
     </w:p>
     <w:p>
@@ -10271,7 +10071,7 @@
           <w:i w:val="0"/>
           <w:sz w:val="22"/>
         </w:rPr>
-        <w:t>Liderança de comunicação/pastoral aplica o termo. A pessoa titular confirma o e-mail.</w:t>
+        <w:t>Secretaria ou pastoral aplica o termo. A pessoa titular confirma o e-mail.</w:t>
       </w:r>
     </w:p>
     <w:p>
@@ -10300,7 +10100,7 @@
           <w:i w:val="0"/>
           <w:sz w:val="22"/>
         </w:rPr>
-        <w:t>Tela `/autorizacao-midia`. Drawer: Super Admin ou canManageMediaAuthorization. Grants SQL em events_admin, lider, lider_geral, pastoral.</w:t>
+        <w:t>Tela `/autorizacao-midia`. Drawer: Super Admin ou grant `/autorizacao-midia`.</w:t>
       </w:r>
     </w:p>
     <w:p>
@@ -10444,7 +10244,7 @@
           <w:i w:val="0"/>
           <w:sz w:val="22"/>
         </w:rPr>
-        <w:t>Sem termo: a igreja não tem base para gravar o culto com aquela pessoa em close. E-mail errado: confirmação nunca chega. Secretaria de propósito não opera isto — encaminhe à pastoral/comunicação.</w:t>
+        <w:t>Sem termo: a igreja não tem base para gravar o culto com aquela pessoa em close. E-mail errado: confirmação nunca chega.</w:t>
       </w:r>
     </w:p>
     <w:p>
@@ -10543,7 +10343,7 @@
           <w:i w:val="0"/>
           <w:sz w:val="22"/>
         </w:rPr>
-        <w:t>Equipe Pastoral e Super Admin (card pastoral-only no desenho atual). Secretaria em geral não herda este card.</w:t>
+        <w:t>Equipe Pastoral, Secretaria e Super Admin.</w:t>
       </w:r>
     </w:p>
     <w:p>
@@ -10612,7 +10412,7 @@
           <w:i w:val="0"/>
           <w:sz w:val="22"/>
         </w:rPr>
-        <w:t>Cadastros nascem da Recepção / Cadastro de Usuário / autoatendimento. Esta tela é consulta pastoral, não o formulário principal de alta.</w:t>
+        <w:t>Cadastros nascem da Recepção / Cadastro de Usuário / autoatendimento. Esta tela é consulta, não o formulário principal de alta.</w:t>
       </w:r>
     </w:p>
     <w:p>
@@ -10760,7 +10560,7 @@
           <w:i w:val="0"/>
           <w:sz w:val="22"/>
         </w:rPr>
-        <w:t>Cadastros podres na origem: o diretório mente. Sem este grant, a pastoral não acha gente no domingo. Secretaria opera pela Recepção/Cadastro, não por aqui, se o item estiver oculto.</w:t>
+        <w:t>Cadastros podres na origem: o diretório mente. Sem este grant, ninguém acha gente no domingo pelo diretório.</w:t>
       </w:r>
     </w:p>
     <w:p>
@@ -10832,7 +10632,7 @@
           <w:i w:val="0"/>
           <w:sz w:val="22"/>
         </w:rPr>
-        <w:t>Quem tem a tela `/mapa-geolocalizacao` e membership ativo, e no menu da engrenagem também manutenção (ou Super Admin). Pastoral e Líder Geral são o uso típico.</w:t>
+        <w:t>Quem tem a tela `/mapa-geolocalizacao` e membership ativo, e no menu da engrenagem também manutenção (ou Super Admin). Pastoral e Secretaria são o uso típico.</w:t>
       </w:r>
     </w:p>
     <w:p>
@@ -11121,7 +10921,7 @@
           <w:i w:val="0"/>
           <w:sz w:val="22"/>
         </w:rPr>
-        <w:t>Equipe Pastoral e Super Admin (pastoral-only). Secretaria em geral não vê.</w:t>
+        <w:t>Equipe Pastoral, Secretaria e Super Admin.</w:t>
       </w:r>
     </w:p>
     <w:p>
@@ -11674,7 +11474,7 @@
           <w:i w:val="0"/>
           <w:sz w:val="22"/>
         </w:rPr>
-        <w:t>Secretaria, Pastoral, Líder Geral (update típico), Gestor, Super Admin. Líder costuma ter visão mais restrita.</w:t>
+        <w:t>Secretaria, Pastoral, Gestor, Super Admin.</w:t>
       </w:r>
     </w:p>
     <w:p>
@@ -11743,7 +11543,7 @@
           <w:i w:val="0"/>
           <w:sz w:val="22"/>
         </w:rPr>
-        <w:t>Secretaria (manutenção cadastral) e liderança de células (vida do grupo). O membro pede vaga em Minha Célula.</w:t>
+        <w:t>Liderança da célula (anfitrião/líder do grupo) no dia a dia; Secretaria cadastra o grupo.</w:t>
       </w:r>
     </w:p>
     <w:p>
@@ -12013,7 +11813,7 @@
           <w:i w:val="0"/>
           <w:sz w:val="22"/>
         </w:rPr>
-        <w:t>Super Admin, Pastoral, Líder Geral, Líder, Gestor (update típico). Secretaria não recebe este grant no papel operacional atual.</w:t>
+        <w:t>Secretaria, Pastoral, Gestor, Super Admin.</w:t>
       </w:r>
     </w:p>
     <w:p>
@@ -12082,7 +11882,7 @@
           <w:i w:val="0"/>
           <w:sz w:val="22"/>
         </w:rPr>
-        <w:t>Liderança da área (louvor, kids, etc.). Secretaria não substitui o dono da vaga.</w:t>
+        <w:t>Secretaria (ou pastoral) cadastra a vaga; o ministério dono trata os interesses.</w:t>
       </w:r>
     </w:p>
     <w:p>
@@ -12327,7 +12127,7 @@
           <w:i w:val="0"/>
           <w:sz w:val="22"/>
         </w:rPr>
-        <w:t>Super Admin, Pastoral, Líder Geral, Líder. Secretaria não.</w:t>
+        <w:t>Secretaria, Pastoral, Super Admin.</w:t>
       </w:r>
     </w:p>
     <w:p>
@@ -12396,7 +12196,7 @@
           <w:i w:val="0"/>
           <w:sz w:val="22"/>
         </w:rPr>
-        <w:t>Liderança de cuidado/diaconia. O membro só envia para moderação.</w:t>
+        <w:t>Secretaria ou pastoral. O membro só envia para moderação.</w:t>
       </w:r>
     </w:p>
     <w:p>
@@ -12955,7 +12755,7 @@
           <w:i w:val="0"/>
           <w:sz w:val="22"/>
         </w:rPr>
-        <w:t>Quem tem `maintenance.card.visitor_followup` e/ou o grant de cadastro (welcome). Pastoral vê o desdobramento pastoral. Secretaria opera o welcome se o grant estiver na instância.</w:t>
+        <w:t>Secretaria (welcome) e Super Admin. Pastoral vê o desdobramento se o caso virar cuidado.</w:t>
       </w:r>
     </w:p>
     <w:p>
@@ -13834,7 +13634,7 @@
           <w:i w:val="0"/>
           <w:sz w:val="22"/>
         </w:rPr>
-        <w:t>Secretaria, Líder, Gestor, Super Admin (e tesoureiro para ajuste retroativo, conforme grant). Super Admin irrestrito.</w:t>
+        <w:t>Secretaria, Gestor, Super Admin (Tesoureiro pode ajustar evento passado, conforme grant).</w:t>
       </w:r>
     </w:p>
     <w:p>
@@ -14512,7 +14312,7 @@
           <w:i w:val="0"/>
           <w:sz w:val="22"/>
         </w:rPr>
-        <w:t>Secretaria, Orquestrador de Evento, Gestor, Super Admin.</w:t>
+        <w:t>Secretaria, Gestor, Super Admin.</w:t>
       </w:r>
     </w:p>
     <w:p>
@@ -14581,7 +14381,7 @@
           <w:i w:val="0"/>
           <w:sz w:val="22"/>
         </w:rPr>
-        <w:t>Secretaria redige. Orquestrador dispara na hora do culto. `profile_is_event_control_admin` = Super Admin OU papel orquestrador OU update neste card.</w:t>
+        <w:t>Secretaria redige e dispara na hora do culto. `profile_is_event_control_admin` = Super Admin OU papel Secretaria OU update neste card.</w:t>
       </w:r>
     </w:p>
     <w:p>
@@ -14826,7 +14626,7 @@
           <w:i w:val="0"/>
           <w:sz w:val="22"/>
         </w:rPr>
-        <w:t>Secretaria, Administrador de eventos, Gestor, Super Admin — e quem estiver no aparelho da sala.</w:t>
+        <w:t>Secretaria, Gestor, Super Admin — e quem estiver no aparelho da sala.</w:t>
       </w:r>
     </w:p>
     <w:p>
@@ -15140,7 +14940,7 @@
           <w:i w:val="0"/>
           <w:sz w:val="22"/>
         </w:rPr>
-        <w:t>Secretaria, Gestor, Super Admin. Líder em geral não cria tipo, só programa os que lidera.</w:t>
+        <w:t>Secretaria, Gestor, Super Admin.</w:t>
       </w:r>
     </w:p>
     <w:p>
@@ -15209,7 +15009,7 @@
           <w:i w:val="0"/>
           <w:sz w:val="22"/>
         </w:rPr>
-        <w:t>Secretaria. Código do tipo deve ser estável (a ACL de líder pode apontar para `scale_type.CODIGO`).</w:t>
+        <w:t>Secretaria. Código do tipo deve ser estável.</w:t>
       </w:r>
     </w:p>
     <w:p>
@@ -15382,7 +15182,7 @@
           <w:i w:val="0"/>
           <w:sz w:val="22"/>
         </w:rPr>
-        <w:t>Sem tipos: não há como cadastrar servo nem programar. Código mudado depois: líderes perdem o grant daquele tipo.</w:t>
+        <w:t>Sem tipos: não há como cadastrar servo nem programar. Código mudado depois: grants `scale_type.*` antigos deixam de bater.</w:t>
       </w:r>
     </w:p>
     <w:p>
@@ -15454,7 +15254,7 @@
           <w:i w:val="0"/>
           <w:sz w:val="22"/>
         </w:rPr>
-        <w:t>Secretaria, Líder, Líder Geral, Gestor, Super Admin.</w:t>
+        <w:t>Secretaria, Gestor, Super Admin.</w:t>
       </w:r>
     </w:p>
     <w:p>
@@ -15523,7 +15323,7 @@
           <w:i w:val="0"/>
           <w:sz w:val="22"/>
         </w:rPr>
-        <w:t>Secretaria monta a base. Líder indica os nomes da sua área.</w:t>
+        <w:t>Secretaria monta a base com os nomes de cada ministério.</w:t>
       </w:r>
     </w:p>
     <w:p>
@@ -15743,7 +15543,7 @@
           <w:i w:val="0"/>
           <w:sz w:val="22"/>
         </w:rPr>
-        <w:t>Secretaria, Líder, Líder Geral, Gestor, Super Admin.</w:t>
+        <w:t>Secretaria, Gestor, Super Admin.</w:t>
       </w:r>
     </w:p>
     <w:p>
@@ -15812,7 +15612,7 @@
           <w:i w:val="0"/>
           <w:sz w:val="22"/>
         </w:rPr>
-        <w:t>Secretaria fecha a escala da semana. Líder programa os tipos que lidera.</w:t>
+        <w:t>Secretaria fecha a escala da semana (todos os tipos ativos).</w:t>
       </w:r>
     </w:p>
     <w:p>
@@ -16057,7 +15857,7 @@
           <w:i w:val="0"/>
           <w:sz w:val="22"/>
         </w:rPr>
-        <w:t>Secretaria, Administrador de eventos, Gestor, Super Admin.</w:t>
+        <w:t>Secretaria, Gestor, Super Admin.</w:t>
       </w:r>
     </w:p>
     <w:p>
@@ -16371,7 +16171,7 @@
           <w:i w:val="0"/>
           <w:sz w:val="22"/>
         </w:rPr>
-        <w:t>Orquestrador de Evento, Secretaria, Super Admin.</w:t>
+        <w:t>Secretaria e Super Admin (quem opera o projetor no culto).</w:t>
       </w:r>
     </w:p>
     <w:p>
@@ -16615,7 +16415,7 @@
           <w:color w:val="4A5568"/>
           <w:sz w:val="22"/>
         </w:rPr>
-        <w:t>Secretaria não acessa este grupo. Tesoureiro e Super Admin são o núcleo.</w:t>
+        <w:t>Tesoureiro e Super Admin são o núcleo do livro caixa e do preditivo. Secretaria vê Gestão de Campanhas (grant absorvido); não vê Informações Financeiras nem Modelo Preditivo.</w:t>
       </w:r>
     </w:p>
     <w:p>
@@ -17026,7 +16826,7 @@
           <w:i w:val="0"/>
           <w:sz w:val="22"/>
         </w:rPr>
-        <w:t>Super Admin, Pastoral, Tesoureiro, Líder Geral (update típico). Gestor em view. Secretaria não.</w:t>
+        <w:t>Secretaria, Pastoral, Tesoureiro, Super Admin. Gestor em view.</w:t>
       </w:r>
     </w:p>
     <w:p>
@@ -17095,7 +16895,7 @@
           <w:i w:val="0"/>
           <w:sz w:val="22"/>
         </w:rPr>
-        <w:t>Tesouraria/pastoral donos da campanha.</w:t>
+        <w:t>Secretaria ou tesouraria/pastoral donos da campanha.</w:t>
       </w:r>
     </w:p>
     <w:p>
@@ -17606,7 +17406,7 @@
           <w:i w:val="0"/>
           <w:sz w:val="22"/>
         </w:rPr>
-        <w:t>Administrador de eventos, Gestor, Pastoral, Tesoureiro, Super Admin. Secretaria não no papel atual.</w:t>
+        <w:t>Secretaria (view), Gestor, Pastoral, Tesoureiro, Super Admin.</w:t>
       </w:r>
     </w:p>
     <w:p>
@@ -19365,7 +19165,7 @@
           <w:i w:val="0"/>
           <w:sz w:val="22"/>
         </w:rPr>
-        <w:t>Super Admin, Pastoral, Líder, Líder Geral (e quem o drawer libera via Cuidado Pastoral). Reset NÃO é este item.</w:t>
+        <w:t>Secretaria, Pastoral e Super Admin. Reset NÃO é este item.</w:t>
       </w:r>
     </w:p>
     <w:p>
@@ -19484,7 +19284,7 @@
           <w:i w:val="0"/>
           <w:sz w:val="22"/>
         </w:rPr>
-        <w:t>Pastoral / discipulado. Super Admin em última instância.</w:t>
+        <w:t>Secretaria ou pastoral/discipulado. Super Admin em última instância.</w:t>
       </w:r>
     </w:p>
     <w:p>
@@ -19773,7 +19573,7 @@
           <w:i w:val="0"/>
           <w:sz w:val="22"/>
         </w:rPr>
-        <w:t>Pastoral/discipulado entrega o reconhecimento. Não é a Secretaria.</w:t>
+        <w:t>Secretaria ou pastoral/discipulado entrega o reconhecimento.</w:t>
       </w:r>
     </w:p>
     <w:p>
@@ -20844,7 +20644,7 @@
           <w:i w:val="0"/>
           <w:sz w:val="22"/>
         </w:rPr>
-        <w:t>Manutenção de Avisos do boletim da home / telão.</w:t>
+        <w:t>Manutenção de Avisos do boletim da home / telão. No culto, abra o Orquestrador no projetor.</w:t>
       </w:r>
     </w:p>
     <w:p>
@@ -21077,7 +20877,7 @@
           <w:i w:val="0"/>
           <w:sz w:val="22"/>
         </w:rPr>
-        <w:t>lib/accessRoleDisplayOrder.ts e scripts/access-control-*.sql — papéis (inclui secretaria).</w:t>
+        <w:t>lib/accessRoleDisplayOrder.ts e scripts/access-control-*.sql — papéis atuais (Secretaria absorveu Líder / Líder Geral / Administrador de Eventos / Orquestrador).</w:t>
       </w:r>
     </w:p>
     <w:p>

</xml_diff>

<commit_message>
Atualiza a análise institucional e o manual Faça Você Mesmo com o caminho publicado, livros, declaração LGPD, Ghost e Aliança.
Co-authored-by: Cursor <cursoragent@cursor.com>
</commit_message>
<xml_diff>
--- a/docs/MANUAL_OPERACAO_CONECTA_FACA_VOCE_MESMO.docx
+++ b/docs/MANUAL_OPERACAO_CONECTA_FACA_VOCE_MESMO.docx
@@ -66,7 +66,7 @@
           <w:color w:val="4A5568"/>
           <w:sz w:val="24"/>
         </w:rPr>
-        <w:t>Documento gerado a partir do código-fonte publicado (menus, rotas e ACL). Papéis Líder, Líder Geral, Administrador de Eventos e Orquestrador de Evento foram absorvidos pela Secretaria e não existem mais.</w:t>
+        <w:t>Documento gerado a partir do código-fonte publicado (menus, rotas e ACL). Inclui Cantinho da Leitura, Livros doados (ISBN/Bipar/CBL e empréstimos), Declaração de Privacidade no Sobre o Conecta+, Modo Ghost e Aliança Conecta Reino. Papéis Líder, Líder Geral, Administrador de Eventos e Orquestrador de Evento foram absorvidos pela Secretaria e não existem mais.</w:t>
       </w:r>
     </w:p>
     <w:p>
@@ -82,7 +82,7 @@
           <w:color w:val="4A5568"/>
           <w:sz w:val="24"/>
         </w:rPr>
-        <w:t>Data de geração: 30/08/2026</w:t>
+        <w:t>Data de geração: 31/08/2026</w:t>
       </w:r>
     </w:p>
     <w:p>
@@ -655,7 +655,7 @@
                 <w:i w:val="0"/>
                 <w:sz w:val="20"/>
               </w:rPr>
-              <w:t>Operação da igreja: eventos, orquestração, escalas (todos os tipos), salas, totem, células, recepção, avisos, mídia, murais, campanhas e temas da Trilha. Sem Cuidados Pastorais nem tesouraria global.</w:t>
+              <w:t>Operação da igreja: eventos, orquestração, escalas (todos os tipos), salas, totem, células, recepção, avisos, mídia, murais, campanhas, acervo/empréstimos de livros e temas da Trilha. Sem Cuidados Pastorais nem tesouraria global.</w:t>
             </w:r>
           </w:p>
         </w:tc>
@@ -873,7 +873,7 @@
           <w:i w:val="0"/>
           <w:sz w:val="22"/>
         </w:rPr>
-        <w:t>Regras que atravessam o manual: (1) cada igreja (tenant) só enxerga os próprios dados; (2) alguns menus exigem vínculo ativo (membership_out vazio); (3) no Modo Ghost a identidade usada é a da pessoa auditada, não a do operador; (4) o Gestor não lista Super Administrador; (5) não existem mais os papéis Líder, Líder Geral, Administrador de Eventos nem Orquestrador — a operação correspondente é da Secretaria.</w:t>
+        <w:t>Regras que atravessam o manual: (1) cada igreja (tenant) só enxerga os próprios dados; (2) alguns menus exigem vínculo ativo (membership_out vazio); (3) no Modo Ghost a identidade usada é a da pessoa auditada, não a do operador; (4) o Gestor não lista Super Administrador; (5) não existem mais os papéis Líder, Líder Geral, Administrador de Eventos nem Orquestrador — a operação correspondente é da Secretaria; (6) desligado no acervo de livros é só membership_out, nunca o flag is_active do cadastro.</w:t>
       </w:r>
     </w:p>
     <w:p>
@@ -4940,7 +4940,7 @@
           <w:i w:val="0"/>
           <w:sz w:val="22"/>
         </w:rPr>
-        <w:t>Hub «Perfil &amp; Identidade»: carteirinha com QR de check-in, dados cadastrais, família, trilha e reembolsos (conforme grants).</w:t>
+        <w:t>Hub «Perfil &amp; Identidade»: carteirinha com QR de check-in, dados cadastrais, família, trilha, reembolsos e Cantinho da Leitura (conforme grants).</w:t>
         <w:br/>
         <w:t>Rota técnica: /perfil  — moduleKey menu_perfil  — card dashboard.card.grouped_manage</w:t>
       </w:r>
@@ -5109,7 +5109,7 @@
           <w:i w:val="0"/>
           <w:sz w:val="22"/>
         </w:rPr>
-        <w:t>Abra Perfil e escolha a ação (as seções 2.2.1 a 2.2.5 abaixo).</w:t>
+        <w:t>Abra Perfil e escolha a ação (as seções 2.2.1 a 2.2.6 abaixo).</w:t>
       </w:r>
     </w:p>
     <w:p>
@@ -6720,6 +6720,345 @@
           <w:rFonts w:ascii="Calibri" w:hAnsi="Calibri"/>
           <w:color w:val="1E3A5F"/>
         </w:rPr>
+        <w:t>2.2.6  Cantinho da Leitura</w:t>
+      </w:r>
+    </w:p>
+    <w:p>
+      <w:pPr>
+        <w:spacing w:after="40" w:before="120"/>
+      </w:pPr>
+      <w:r>
+        <w:rPr>
+          <w:rFonts w:ascii="Calibri" w:hAnsi="Calibri" w:eastAsia="Calibri"/>
+          <w:b/>
+          <w:i w:val="0"/>
+          <w:color w:val="1E3A5F"/>
+          <w:sz w:val="22"/>
+        </w:rPr>
+        <w:t>Referência e nome da funcionalidade</w:t>
+      </w:r>
+    </w:p>
+    <w:p>
+      <w:pPr>
+        <w:spacing w:after="120" w:before="0" w:line="240" w:lineRule="auto"/>
+      </w:pPr>
+      <w:r>
+        <w:rPr>
+          <w:rFonts w:ascii="Calibri" w:hAnsi="Calibri" w:eastAsia="Calibri"/>
+          <w:b w:val="0"/>
+          <w:i w:val="0"/>
+          <w:sz w:val="22"/>
+        </w:rPr>
+        <w:t>Reserva de livros do acervo da igreja: lista alfabética (um título por linha), ficha (capa, autor, editora, ano, ISBN) e prazo de 30 dias. A Secretaria confirma a retirada.</w:t>
+        <w:br/>
+        <w:t>Rota técnica: Painel MeusLivrosRetiradosPanel dentro de /perfil</w:t>
+      </w:r>
+    </w:p>
+    <w:p>
+      <w:pPr>
+        <w:spacing w:after="40" w:before="120"/>
+      </w:pPr>
+      <w:r>
+        <w:rPr>
+          <w:rFonts w:ascii="Calibri" w:hAnsi="Calibri" w:eastAsia="Calibri"/>
+          <w:b/>
+          <w:i w:val="0"/>
+          <w:color w:val="1E3A5F"/>
+          <w:sz w:val="22"/>
+        </w:rPr>
+        <w:t>Quem acessa / visualiza</w:t>
+      </w:r>
+    </w:p>
+    <w:p>
+      <w:pPr>
+        <w:spacing w:after="120" w:before="0" w:line="240" w:lineRule="auto"/>
+      </w:pPr>
+      <w:r>
+        <w:rPr>
+          <w:rFonts w:ascii="Calibri" w:hAnsi="Calibri" w:eastAsia="Calibri"/>
+          <w:b w:val="0"/>
+          <w:i w:val="0"/>
+          <w:sz w:val="22"/>
+        </w:rPr>
+        <w:t>Quem abre o hub Perfil (card grouped_manage). O acervo é o mesmo de Livros doados.</w:t>
+      </w:r>
+    </w:p>
+    <w:p>
+      <w:pPr>
+        <w:spacing w:after="80" w:before="120" w:line="240" w:lineRule="auto"/>
+      </w:pPr>
+      <w:r>
+        <w:rPr>
+          <w:rFonts w:ascii="Calibri" w:hAnsi="Calibri" w:eastAsia="Calibri"/>
+          <w:b/>
+          <w:i w:val="0"/>
+          <w:color w:val="1E3A5F"/>
+          <w:sz w:val="22"/>
+        </w:rPr>
+        <w:t>Como acessar (passo a passo)</w:t>
+      </w:r>
+    </w:p>
+    <w:p>
+      <w:pPr>
+        <w:spacing w:after="80" w:before="0"/>
+        <w:ind w:left="283"/>
+      </w:pPr>
+      <w:r>
+        <w:rPr>
+          <w:rFonts w:ascii="Calibri" w:hAnsi="Calibri" w:eastAsia="Calibri"/>
+          <w:b/>
+          <w:i w:val="0"/>
+          <w:color w:val="0F4C81"/>
+          <w:sz w:val="22"/>
+        </w:rPr>
+        <w:t xml:space="preserve">1. </w:t>
+      </w:r>
+      <w:r>
+        <w:rPr>
+          <w:rFonts w:ascii="Calibri" w:hAnsi="Calibri" w:eastAsia="Calibri"/>
+          <w:b w:val="0"/>
+          <w:i w:val="0"/>
+          <w:sz w:val="22"/>
+        </w:rPr>
+        <w:t>Menu → Perfil → Cantinho da Leitura.</w:t>
+      </w:r>
+    </w:p>
+    <w:p>
+      <w:pPr>
+        <w:spacing w:after="40" w:before="120"/>
+      </w:pPr>
+      <w:r>
+        <w:rPr>
+          <w:rFonts w:ascii="Calibri" w:hAnsi="Calibri" w:eastAsia="Calibri"/>
+          <w:b/>
+          <w:i w:val="0"/>
+          <w:color w:val="1E3A5F"/>
+          <w:sz w:val="22"/>
+        </w:rPr>
+        <w:t>Quem gerencia / cria / altera</w:t>
+      </w:r>
+    </w:p>
+    <w:p>
+      <w:pPr>
+        <w:spacing w:after="120" w:before="0" w:line="240" w:lineRule="auto"/>
+      </w:pPr>
+      <w:r>
+        <w:rPr>
+          <w:rFonts w:ascii="Calibri" w:hAnsi="Calibri" w:eastAsia="Calibri"/>
+          <w:b w:val="0"/>
+          <w:i w:val="0"/>
+          <w:sz w:val="22"/>
+        </w:rPr>
+        <w:t>O membro reserva e pode cancelar a reserva. Secretaria confirma retirada, renova (+10 dias), registra devolução e cadastra o ISBN em Livros doados.</w:t>
+      </w:r>
+    </w:p>
+    <w:p>
+      <w:pPr>
+        <w:spacing w:after="40" w:before="120"/>
+      </w:pPr>
+      <w:r>
+        <w:rPr>
+          <w:rFonts w:ascii="Calibri" w:hAnsi="Calibri" w:eastAsia="Calibri"/>
+          <w:b/>
+          <w:i w:val="0"/>
+          <w:color w:val="1E3A5F"/>
+          <w:sz w:val="22"/>
+        </w:rPr>
+        <w:t>Permissão necessária (ACL)</w:t>
+      </w:r>
+    </w:p>
+    <w:p>
+      <w:pPr>
+        <w:spacing w:after="120" w:before="0" w:line="240" w:lineRule="auto"/>
+      </w:pPr>
+      <w:r>
+        <w:rPr>
+          <w:rFonts w:ascii="Calibri" w:hAnsi="Calibri" w:eastAsia="Calibri"/>
+          <w:b w:val="0"/>
+          <w:i w:val="0"/>
+          <w:sz w:val="22"/>
+        </w:rPr>
+        <w:t>Hub `dashboard.card.grouped_manage`. Operação do acervo: tela `/livros-doados`. RPCs `list_livros_disponiveis_reserva`, `reservar_livro_acervo`, `cancelar_reserva_livro`. Isolamento por tenant.</w:t>
+      </w:r>
+    </w:p>
+    <w:p>
+      <w:pPr>
+        <w:spacing w:after="80" w:before="120" w:line="240" w:lineRule="auto"/>
+      </w:pPr>
+      <w:r>
+        <w:rPr>
+          <w:rFonts w:ascii="Calibri" w:hAnsi="Calibri" w:eastAsia="Calibri"/>
+          <w:b/>
+          <w:i w:val="0"/>
+          <w:color w:val="1E3A5F"/>
+          <w:sz w:val="22"/>
+        </w:rPr>
+        <w:t>Como e quando preencher (guia prático)</w:t>
+      </w:r>
+    </w:p>
+    <w:p>
+      <w:pPr>
+        <w:spacing w:after="80" w:before="0"/>
+        <w:ind w:left="283"/>
+      </w:pPr>
+      <w:r>
+        <w:rPr>
+          <w:rFonts w:ascii="Calibri" w:hAnsi="Calibri" w:eastAsia="Calibri"/>
+          <w:b/>
+          <w:i w:val="0"/>
+          <w:color w:val="0F4C81"/>
+          <w:sz w:val="22"/>
+        </w:rPr>
+        <w:t xml:space="preserve">1. </w:t>
+      </w:r>
+      <w:r>
+        <w:rPr>
+          <w:rFonts w:ascii="Calibri" w:hAnsi="Calibri" w:eastAsia="Calibri"/>
+          <w:b w:val="0"/>
+          <w:i w:val="0"/>
+          <w:sz w:val="22"/>
+        </w:rPr>
+        <w:t>Abra a lista (ordem A–Z). Toque no título para ver capa, autor, editora, ano e ISBN.</w:t>
+      </w:r>
+    </w:p>
+    <w:p>
+      <w:pPr>
+        <w:spacing w:after="80" w:before="0"/>
+        <w:ind w:left="283"/>
+      </w:pPr>
+      <w:r>
+        <w:rPr>
+          <w:rFonts w:ascii="Calibri" w:hAnsi="Calibri" w:eastAsia="Calibri"/>
+          <w:b/>
+          <w:i w:val="0"/>
+          <w:color w:val="0F4C81"/>
+          <w:sz w:val="22"/>
+        </w:rPr>
+        <w:t xml:space="preserve">2. </w:t>
+      </w:r>
+      <w:r>
+        <w:rPr>
+          <w:rFonts w:ascii="Calibri" w:hAnsi="Calibri" w:eastAsia="Calibri"/>
+          <w:b w:val="0"/>
+          <w:i w:val="0"/>
+          <w:sz w:val="22"/>
+        </w:rPr>
+        <w:t>Escolha a data de retirada. O retorno inicial é 30 dias.</w:t>
+      </w:r>
+    </w:p>
+    <w:p>
+      <w:pPr>
+        <w:spacing w:after="80" w:before="0"/>
+        <w:ind w:left="283"/>
+      </w:pPr>
+      <w:r>
+        <w:rPr>
+          <w:rFonts w:ascii="Calibri" w:hAnsi="Calibri" w:eastAsia="Calibri"/>
+          <w:b/>
+          <w:i w:val="0"/>
+          <w:color w:val="0F4C81"/>
+          <w:sz w:val="22"/>
+        </w:rPr>
+        <w:t xml:space="preserve">3. </w:t>
+      </w:r>
+      <w:r>
+        <w:rPr>
+          <w:rFonts w:ascii="Calibri" w:hAnsi="Calibri" w:eastAsia="Calibri"/>
+          <w:b w:val="0"/>
+          <w:i w:val="0"/>
+          <w:sz w:val="22"/>
+        </w:rPr>
+        <w:t>Toque em Reservar — o botão só habilita com um livro selecionado.</w:t>
+      </w:r>
+    </w:p>
+    <w:p>
+      <w:pPr>
+        <w:spacing w:after="80" w:before="0"/>
+        <w:ind w:left="283"/>
+      </w:pPr>
+      <w:r>
+        <w:rPr>
+          <w:rFonts w:ascii="Calibri" w:hAnsi="Calibri" w:eastAsia="Calibri"/>
+          <w:b/>
+          <w:i w:val="0"/>
+          <w:color w:val="0F4C81"/>
+          <w:sz w:val="22"/>
+        </w:rPr>
+        <w:t xml:space="preserve">4. </w:t>
+      </w:r>
+      <w:r>
+        <w:rPr>
+          <w:rFonts w:ascii="Calibri" w:hAnsi="Calibri" w:eastAsia="Calibri"/>
+          <w:b w:val="0"/>
+          <w:i w:val="0"/>
+          <w:sz w:val="22"/>
+        </w:rPr>
+        <w:t>Acompanhe «Meus empréstimos». Cancele a reserva se desistir antes da Secretaria confirmar.</w:t>
+      </w:r>
+    </w:p>
+    <w:p>
+      <w:pPr>
+        <w:spacing w:after="80" w:before="0"/>
+        <w:ind w:left="283"/>
+      </w:pPr>
+      <w:r>
+        <w:rPr>
+          <w:rFonts w:ascii="Calibri" w:hAnsi="Calibri" w:eastAsia="Calibri"/>
+          <w:b/>
+          <w:i w:val="0"/>
+          <w:color w:val="0F4C81"/>
+          <w:sz w:val="22"/>
+        </w:rPr>
+        <w:t xml:space="preserve">5. </w:t>
+      </w:r>
+      <w:r>
+        <w:rPr>
+          <w:rFonts w:ascii="Calibri" w:hAnsi="Calibri" w:eastAsia="Calibri"/>
+          <w:b w:val="0"/>
+          <w:i w:val="0"/>
+          <w:sz w:val="22"/>
+        </w:rPr>
+        <w:t>Não cadastre ISBN aqui: doação e bipar são da Secretaria (item 3.B.12).</w:t>
+      </w:r>
+    </w:p>
+    <w:p>
+      <w:pPr>
+        <w:spacing w:before="160" w:after="40"/>
+      </w:pPr>
+      <w:r>
+        <w:rPr>
+          <w:rFonts w:ascii="Calibri" w:hAnsi="Calibri" w:eastAsia="Calibri"/>
+          <w:b/>
+          <w:i w:val="0"/>
+          <w:color w:val="8B1E1E"/>
+          <w:sz w:val="22"/>
+        </w:rPr>
+        <w:t>O que implica se não for preenchido a contento</w:t>
+      </w:r>
+    </w:p>
+    <w:p>
+      <w:pPr>
+        <w:spacing w:after="280" w:before="0" w:line="240" w:lineRule="auto"/>
+      </w:pPr>
+      <w:r>
+        <w:rPr>
+          <w:rFonts w:ascii="Calibri" w:hAnsi="Calibri" w:eastAsia="Calibri"/>
+          <w:b w:val="0"/>
+          <w:i w:val="0"/>
+          <w:sz w:val="22"/>
+        </w:rPr>
+        <w:t>Sem acervo cadastrado: lista vazia. Reservar sem confirmação da Secretaria: o livro não sai. Duas famílias na mesma reserva: o índice único do livro ativo impede — o título some da lista disponível.</w:t>
+      </w:r>
+    </w:p>
+    <w:p>
+      <w:pPr>
+        <w:pStyle w:val="Heading2"/>
+      </w:pPr>
+      <w:r>
+        <w:rPr>
+          <w:rFonts w:ascii="Calibri" w:hAnsi="Calibri"/>
+          <w:color w:val="1E3A5F"/>
+        </w:rPr>
         <w:t>2.3  Financeiro</w:t>
       </w:r>
     </w:p>
@@ -9022,7 +9361,7 @@
           <w:i w:val="0"/>
           <w:sz w:val="22"/>
         </w:rPr>
-        <w:t>Texto institucional e número de versão/revisão do aplicativo.</w:t>
+        <w:t>Texto institucional, número de versão/revisão e a Declaração de Privacidade e Segurança de Dados (LGPD) em leitura completa.</w:t>
         <w:br/>
         <w:t>Rota técnica: /sobre-conecta  — sempre visível</w:t>
       </w:r>
@@ -9122,7 +9461,7 @@
           <w:i w:val="0"/>
           <w:sz w:val="22"/>
         </w:rPr>
-        <w:t>Equipe de produto/Super Admin (texto e versão no build). O membro só lê.</w:t>
+        <w:t>Equipe de produto/Super Admin (texto, versão e declaração no código). O membro só lê. O aceite jurídico de cadastro continua em /lgpd — esta tela não substitui o rito de aceite.</w:t>
       </w:r>
     </w:p>
     <w:p>
@@ -9191,7 +9530,82 @@
           <w:i w:val="0"/>
           <w:sz w:val="22"/>
         </w:rPr>
-        <w:t>Leia. Anote a versão se for abrir um chamado em Sugestões.</w:t>
+        <w:t>Leia o texto Sobre e anote Versão / Revisão se for abrir um chamado em Sugestões.</w:t>
+      </w:r>
+    </w:p>
+    <w:p>
+      <w:pPr>
+        <w:spacing w:after="80" w:before="0"/>
+        <w:ind w:left="283"/>
+      </w:pPr>
+      <w:r>
+        <w:rPr>
+          <w:rFonts w:ascii="Calibri" w:hAnsi="Calibri" w:eastAsia="Calibri"/>
+          <w:b/>
+          <w:i w:val="0"/>
+          <w:color w:val="0F4C81"/>
+          <w:sz w:val="22"/>
+        </w:rPr>
+        <w:t xml:space="preserve">2. </w:t>
+      </w:r>
+      <w:r>
+        <w:rPr>
+          <w:rFonts w:ascii="Calibri" w:hAnsi="Calibri" w:eastAsia="Calibri"/>
+          <w:b w:val="0"/>
+          <w:i w:val="0"/>
+          <w:sz w:val="22"/>
+        </w:rPr>
+        <w:t>Toque em «Declaração de Privacidade e Segurança de Dados (LGPD)».</w:t>
+      </w:r>
+    </w:p>
+    <w:p>
+      <w:pPr>
+        <w:spacing w:after="80" w:before="0"/>
+        <w:ind w:left="283"/>
+      </w:pPr>
+      <w:r>
+        <w:rPr>
+          <w:rFonts w:ascii="Calibri" w:hAnsi="Calibri" w:eastAsia="Calibri"/>
+          <w:b/>
+          <w:i w:val="0"/>
+          <w:color w:val="0F4C81"/>
+          <w:sz w:val="22"/>
+        </w:rPr>
+        <w:t xml:space="preserve">3. </w:t>
+      </w:r>
+      <w:r>
+        <w:rPr>
+          <w:rFonts w:ascii="Calibri" w:hAnsi="Calibri" w:eastAsia="Calibri"/>
+          <w:b w:val="0"/>
+          <w:i w:val="0"/>
+          <w:sz w:val="22"/>
+        </w:rPr>
+        <w:t>Role os sete pontos (isolamento por igreja, mural sem telefone, sem vitrine de dons, QR só com código familiar, mapa, sigilo pastoral, escudo do Super Administrador).</w:t>
+      </w:r>
+    </w:p>
+    <w:p>
+      <w:pPr>
+        <w:spacing w:after="80" w:before="0"/>
+        <w:ind w:left="283"/>
+      </w:pPr>
+      <w:r>
+        <w:rPr>
+          <w:rFonts w:ascii="Calibri" w:hAnsi="Calibri" w:eastAsia="Calibri"/>
+          <w:b/>
+          <w:i w:val="0"/>
+          <w:color w:val="0F4C81"/>
+          <w:sz w:val="22"/>
+        </w:rPr>
+        <w:t xml:space="preserve">4. </w:t>
+      </w:r>
+      <w:r>
+        <w:rPr>
+          <w:rFonts w:ascii="Calibri" w:hAnsi="Calibri" w:eastAsia="Calibri"/>
+          <w:b w:val="0"/>
+          <w:i w:val="0"/>
+          <w:sz w:val="22"/>
+        </w:rPr>
+        <w:t>Use Fechar no rodapé da declaração para voltar ao Sobre.</w:t>
       </w:r>
     </w:p>
     <w:p>
@@ -9220,7 +9634,7 @@
           <w:i w:val="0"/>
           <w:sz w:val="22"/>
         </w:rPr>
-        <w:t>Não há formulário. Sem esta tela, suporte e treinamento perdem a referência de versão.</w:t>
+        <w:t>Não há formulário. Sem esta tela, suporte e treinamento perdem a referência de versão e a congregação não encontra a declaração institucional no app.</w:t>
       </w:r>
     </w:p>
     <w:p>
@@ -13555,6 +13969,395 @@
     </w:p>
     <w:p>
       <w:pPr>
+        <w:pStyle w:val="Heading2"/>
+      </w:pPr>
+      <w:r>
+        <w:rPr>
+          <w:rFonts w:ascii="Calibri" w:hAnsi="Calibri"/>
+          <w:color w:val="1E3A5F"/>
+        </w:rPr>
+        <w:t>3.B.12  Livros doados</w:t>
+      </w:r>
+    </w:p>
+    <w:p>
+      <w:pPr>
+        <w:spacing w:after="40" w:before="120"/>
+      </w:pPr>
+      <w:r>
+        <w:rPr>
+          <w:rFonts w:ascii="Calibri" w:hAnsi="Calibri" w:eastAsia="Calibri"/>
+          <w:b/>
+          <w:i w:val="0"/>
+          <w:color w:val="1E3A5F"/>
+          <w:sz w:val="22"/>
+        </w:rPr>
+        <w:t>Referência e nome da funcionalidade</w:t>
+      </w:r>
+    </w:p>
+    <w:p>
+      <w:pPr>
+        <w:spacing w:after="120" w:before="0" w:line="240" w:lineRule="auto"/>
+      </w:pPr>
+      <w:r>
+        <w:rPr>
+          <w:rFonts w:ascii="Calibri" w:hAnsi="Calibri" w:eastAsia="Calibri"/>
+          <w:b w:val="0"/>
+          <w:i w:val="0"/>
+          <w:sz w:val="22"/>
+        </w:rPr>
+        <w:t>Acervo da igreja (ISBN, Bipar, cadastro manual) e empréstimos da Secretaria: confirmar retirada, renovar +10 dias, devolver, WhatsApp do prazo e histórico.</w:t>
+        <w:br/>
+        <w:t>Rota técnica: /livros-doados  — hint: Acervo com busca ISBN e cadastro manual  — abas Acervo | Empréstimos | Histórico</w:t>
+      </w:r>
+    </w:p>
+    <w:p>
+      <w:pPr>
+        <w:spacing w:after="40" w:before="120"/>
+      </w:pPr>
+      <w:r>
+        <w:rPr>
+          <w:rFonts w:ascii="Calibri" w:hAnsi="Calibri" w:eastAsia="Calibri"/>
+          <w:b/>
+          <w:i w:val="0"/>
+          <w:color w:val="1E3A5F"/>
+          <w:sz w:val="22"/>
+        </w:rPr>
+        <w:t>Quem acessa / visualiza</w:t>
+      </w:r>
+    </w:p>
+    <w:p>
+      <w:pPr>
+        <w:spacing w:after="120" w:before="0" w:line="240" w:lineRule="auto"/>
+      </w:pPr>
+      <w:r>
+        <w:rPr>
+          <w:rFonts w:ascii="Calibri" w:hAnsi="Calibri" w:eastAsia="Calibri"/>
+          <w:b w:val="0"/>
+          <w:i w:val="0"/>
+          <w:sz w:val="22"/>
+        </w:rPr>
+        <w:t>Secretaria e Super Administrador com grant da tela `/livros-doados`. Gestor não opera o acervo por este item salvo grant explícito.</w:t>
+      </w:r>
+    </w:p>
+    <w:p>
+      <w:pPr>
+        <w:spacing w:after="80" w:before="120" w:line="240" w:lineRule="auto"/>
+      </w:pPr>
+      <w:r>
+        <w:rPr>
+          <w:rFonts w:ascii="Calibri" w:hAnsi="Calibri" w:eastAsia="Calibri"/>
+          <w:b/>
+          <w:i w:val="0"/>
+          <w:color w:val="1E3A5F"/>
+          <w:sz w:val="22"/>
+        </w:rPr>
+        <w:t>Como acessar (passo a passo)</w:t>
+      </w:r>
+    </w:p>
+    <w:p>
+      <w:pPr>
+        <w:spacing w:after="80" w:before="0"/>
+        <w:ind w:left="283"/>
+      </w:pPr>
+      <w:r>
+        <w:rPr>
+          <w:rFonts w:ascii="Calibri" w:hAnsi="Calibri" w:eastAsia="Calibri"/>
+          <w:b/>
+          <w:i w:val="0"/>
+          <w:color w:val="0F4C81"/>
+          <w:sz w:val="22"/>
+        </w:rPr>
+        <w:t xml:space="preserve">1. </w:t>
+      </w:r>
+      <w:r>
+        <w:rPr>
+          <w:rFonts w:ascii="Calibri" w:hAnsi="Calibri" w:eastAsia="Calibri"/>
+          <w:b w:val="0"/>
+          <w:i w:val="0"/>
+          <w:sz w:val="22"/>
+        </w:rPr>
+        <w:t>Menu → engrenagem → Gestão de Pessoas → Livros doados.</w:t>
+      </w:r>
+    </w:p>
+    <w:p>
+      <w:pPr>
+        <w:spacing w:after="40" w:before="120"/>
+      </w:pPr>
+      <w:r>
+        <w:rPr>
+          <w:rFonts w:ascii="Calibri" w:hAnsi="Calibri" w:eastAsia="Calibri"/>
+          <w:b/>
+          <w:i w:val="0"/>
+          <w:color w:val="1E3A5F"/>
+          <w:sz w:val="22"/>
+        </w:rPr>
+        <w:t>Quem gerencia / cria / altera</w:t>
+      </w:r>
+    </w:p>
+    <w:p>
+      <w:pPr>
+        <w:spacing w:after="120" w:before="0" w:line="240" w:lineRule="auto"/>
+      </w:pPr>
+      <w:r>
+        <w:rPr>
+          <w:rFonts w:ascii="Calibri" w:hAnsi="Calibri" w:eastAsia="Calibri"/>
+          <w:b w:val="0"/>
+          <w:i w:val="0"/>
+          <w:sz w:val="22"/>
+        </w:rPr>
+        <w:t>Secretaria cadastra doação e registra saída/devolução. O membro só reserva no Cantinho da Leitura (2.2.6).</w:t>
+      </w:r>
+    </w:p>
+    <w:p>
+      <w:pPr>
+        <w:spacing w:after="40" w:before="120"/>
+      </w:pPr>
+      <w:r>
+        <w:rPr>
+          <w:rFonts w:ascii="Calibri" w:hAnsi="Calibri" w:eastAsia="Calibri"/>
+          <w:b/>
+          <w:i w:val="0"/>
+          <w:color w:val="1E3A5F"/>
+          <w:sz w:val="22"/>
+        </w:rPr>
+        <w:t>Permissão necessária (ACL)</w:t>
+      </w:r>
+    </w:p>
+    <w:p>
+      <w:pPr>
+        <w:spacing w:after="120" w:before="0" w:line="240" w:lineRule="auto"/>
+      </w:pPr>
+      <w:r>
+        <w:rPr>
+          <w:rFonts w:ascii="Calibri" w:hAnsi="Calibri" w:eastAsia="Calibri"/>
+          <w:b w:val="0"/>
+          <w:i w:val="0"/>
+          <w:sz w:val="22"/>
+        </w:rPr>
+        <w:t>`ACCESS_SCREEN.livrosDoados` = `/livros-doados`. Tabelas `livros` e `emprestimos_livros`. RPCs em scripts/livros-doados.sql e scripts/emprestimos-livros.sql. Isolamento por tenant_id.</w:t>
+      </w:r>
+    </w:p>
+    <w:p>
+      <w:pPr>
+        <w:spacing w:after="80" w:before="120" w:line="240" w:lineRule="auto"/>
+      </w:pPr>
+      <w:r>
+        <w:rPr>
+          <w:rFonts w:ascii="Calibri" w:hAnsi="Calibri" w:eastAsia="Calibri"/>
+          <w:b/>
+          <w:i w:val="0"/>
+          <w:color w:val="1E3A5F"/>
+          <w:sz w:val="22"/>
+        </w:rPr>
+        <w:t>Como e quando preencher (guia prático)</w:t>
+      </w:r>
+    </w:p>
+    <w:p>
+      <w:pPr>
+        <w:spacing w:after="80" w:before="0"/>
+        <w:ind w:left="283"/>
+      </w:pPr>
+      <w:r>
+        <w:rPr>
+          <w:rFonts w:ascii="Calibri" w:hAnsi="Calibri" w:eastAsia="Calibri"/>
+          <w:b/>
+          <w:i w:val="0"/>
+          <w:color w:val="0F4C81"/>
+          <w:sz w:val="22"/>
+        </w:rPr>
+        <w:t xml:space="preserve">1. </w:t>
+      </w:r>
+      <w:r>
+        <w:rPr>
+          <w:rFonts w:ascii="Calibri" w:hAnsi="Calibri" w:eastAsia="Calibri"/>
+          <w:b w:val="0"/>
+          <w:i w:val="0"/>
+          <w:sz w:val="22"/>
+        </w:rPr>
+        <w:t>Aba Acervo: abra «Registro de Doações». Digite o ISBN ou toque em Bipar (autorize a câmera). Confira título, autor, editora, ano e capa. Se a Google Books recusar (cota), o app tenta o cadastro brasileiro (CBL/BrasilAPI) e a Open Library. Complete o que faltar e salve. A seção fecha e o Acervo abre em ordem alfabética.</w:t>
+      </w:r>
+    </w:p>
+    <w:p>
+      <w:pPr>
+        <w:spacing w:after="80" w:before="0"/>
+        <w:ind w:left="283"/>
+      </w:pPr>
+      <w:r>
+        <w:rPr>
+          <w:rFonts w:ascii="Calibri" w:hAnsi="Calibri" w:eastAsia="Calibri"/>
+          <w:b/>
+          <w:i w:val="0"/>
+          <w:color w:val="0F4C81"/>
+          <w:sz w:val="22"/>
+        </w:rPr>
+        <w:t xml:space="preserve">2. </w:t>
+      </w:r>
+      <w:r>
+        <w:rPr>
+          <w:rFonts w:ascii="Calibri" w:hAnsi="Calibri" w:eastAsia="Calibri"/>
+          <w:b w:val="0"/>
+          <w:i w:val="0"/>
+          <w:sz w:val="22"/>
+        </w:rPr>
+        <w:t>Cadastro manual: use quando o ISBN não existir em nenhum catálogo.</w:t>
+      </w:r>
+    </w:p>
+    <w:p>
+      <w:pPr>
+        <w:spacing w:after="80" w:before="0"/>
+        <w:ind w:left="283"/>
+      </w:pPr>
+      <w:r>
+        <w:rPr>
+          <w:rFonts w:ascii="Calibri" w:hAnsi="Calibri" w:eastAsia="Calibri"/>
+          <w:b/>
+          <w:i w:val="0"/>
+          <w:color w:val="0F4C81"/>
+          <w:sz w:val="22"/>
+        </w:rPr>
+        <w:t xml:space="preserve">3. </w:t>
+      </w:r>
+      <w:r>
+        <w:rPr>
+          <w:rFonts w:ascii="Calibri" w:hAnsi="Calibri" w:eastAsia="Calibri"/>
+          <w:b w:val="0"/>
+          <w:i w:val="0"/>
+          <w:sz w:val="22"/>
+        </w:rPr>
+        <w:t>Aba Empréstimos: busque o membro por nome (mínimo 2 letras) ou telefone (mínimo 2 dígitos — senão a busca não lista a igreja inteira). Escolha o livro livre ou um título externo.</w:t>
+      </w:r>
+    </w:p>
+    <w:p>
+      <w:pPr>
+        <w:spacing w:after="80" w:before="0"/>
+        <w:ind w:left="283"/>
+      </w:pPr>
+      <w:r>
+        <w:rPr>
+          <w:rFonts w:ascii="Calibri" w:hAnsi="Calibri" w:eastAsia="Calibri"/>
+          <w:b/>
+          <w:i w:val="0"/>
+          <w:color w:val="0F4C81"/>
+          <w:sz w:val="22"/>
+        </w:rPr>
+        <w:t xml:space="preserve">4. </w:t>
+      </w:r>
+      <w:r>
+        <w:rPr>
+          <w:rFonts w:ascii="Calibri" w:hAnsi="Calibri" w:eastAsia="Calibri"/>
+          <w:b w:val="0"/>
+          <w:i w:val="0"/>
+          <w:sz w:val="22"/>
+        </w:rPr>
+        <w:t>Registrar empréstimo (30 dias) ou, se houver reserva, Confirmar retirada (use o diálogo da tela; no navegador não basta o alerta nativo).</w:t>
+      </w:r>
+    </w:p>
+    <w:p>
+      <w:pPr>
+        <w:spacing w:after="80" w:before="0"/>
+        <w:ind w:left="283"/>
+      </w:pPr>
+      <w:r>
+        <w:rPr>
+          <w:rFonts w:ascii="Calibri" w:hAnsi="Calibri" w:eastAsia="Calibri"/>
+          <w:b/>
+          <w:i w:val="0"/>
+          <w:color w:val="0F4C81"/>
+          <w:sz w:val="22"/>
+        </w:rPr>
+        <w:t xml:space="preserve">5. </w:t>
+      </w:r>
+      <w:r>
+        <w:rPr>
+          <w:rFonts w:ascii="Calibri" w:hAnsi="Calibri" w:eastAsia="Calibri"/>
+          <w:b w:val="0"/>
+          <w:i w:val="0"/>
+          <w:sz w:val="22"/>
+        </w:rPr>
+        <w:t>Nome em vermelho «(desligado)» só se membership_out estiver preenchido — não confundir com cadastro inativo (is_active).</w:t>
+      </w:r>
+    </w:p>
+    <w:p>
+      <w:pPr>
+        <w:spacing w:after="80" w:before="0"/>
+        <w:ind w:left="283"/>
+      </w:pPr>
+      <w:r>
+        <w:rPr>
+          <w:rFonts w:ascii="Calibri" w:hAnsi="Calibri" w:eastAsia="Calibri"/>
+          <w:b/>
+          <w:i w:val="0"/>
+          <w:color w:val="0F4C81"/>
+          <w:sz w:val="22"/>
+        </w:rPr>
+        <w:t xml:space="preserve">6. </w:t>
+      </w:r>
+      <w:r>
+        <w:rPr>
+          <w:rFonts w:ascii="Calibri" w:hAnsi="Calibri" w:eastAsia="Calibri"/>
+          <w:b w:val="0"/>
+          <w:i w:val="0"/>
+          <w:sz w:val="22"/>
+        </w:rPr>
+        <w:t>WhatsApp verde: mensagem de prazo e pergunta se devolve ou estende 10 dias. Renovar +10 só na renovação (o primeiro ciclo continua 30 dias). Registrar devolução.</w:t>
+      </w:r>
+    </w:p>
+    <w:p>
+      <w:pPr>
+        <w:spacing w:after="80" w:before="0"/>
+        <w:ind w:left="283"/>
+      </w:pPr>
+      <w:r>
+        <w:rPr>
+          <w:rFonts w:ascii="Calibri" w:hAnsi="Calibri" w:eastAsia="Calibri"/>
+          <w:b/>
+          <w:i w:val="0"/>
+          <w:color w:val="0F4C81"/>
+          <w:sz w:val="22"/>
+        </w:rPr>
+        <w:t xml:space="preserve">7. </w:t>
+      </w:r>
+      <w:r>
+        <w:rPr>
+          <w:rFonts w:ascii="Calibri" w:hAnsi="Calibri" w:eastAsia="Calibri"/>
+          <w:b w:val="0"/>
+          <w:i w:val="0"/>
+          <w:sz w:val="22"/>
+        </w:rPr>
+        <w:t>Aba Histórico: rastreio do que já voltou.</w:t>
+      </w:r>
+    </w:p>
+    <w:p>
+      <w:pPr>
+        <w:spacing w:before="160" w:after="40"/>
+      </w:pPr>
+      <w:r>
+        <w:rPr>
+          <w:rFonts w:ascii="Calibri" w:hAnsi="Calibri" w:eastAsia="Calibri"/>
+          <w:b/>
+          <w:i w:val="0"/>
+          <w:color w:val="8B1E1E"/>
+          <w:sz w:val="22"/>
+        </w:rPr>
+        <w:t>O que implica se não for preenchido a contento</w:t>
+      </w:r>
+    </w:p>
+    <w:p>
+      <w:pPr>
+        <w:spacing w:after="280" w:before="0" w:line="240" w:lineRule="auto"/>
+      </w:pPr>
+      <w:r>
+        <w:rPr>
+          <w:rFonts w:ascii="Calibri" w:hAnsi="Calibri" w:eastAsia="Calibri"/>
+          <w:b w:val="0"/>
+          <w:i w:val="0"/>
+          <w:sz w:val="22"/>
+        </w:rPr>
+        <w:t>Sem ISBN/ficha: o Cantinho fica vazio. Busca curta demais: ninguém aparece. Confirmar retirada sem o diálogo da web: o empréstimo não grava. Marcar desligado pelo is_active: falso positivo (membro ativo aparece em vermelho). Sem WhatsApp no cadastro: o ícone não abre conversa. Livro não devolvido: some do acervo disponível.</w:t>
+      </w:r>
+    </w:p>
+    <w:p>
+      <w:pPr>
         <w:pStyle w:val="Heading1"/>
       </w:pPr>
       <w:r>
@@ -20211,7 +21014,321 @@
           <w:rFonts w:ascii="Calibri" w:hAnsi="Calibri"/>
           <w:color w:val="1E3A5F"/>
         </w:rPr>
-        <w:t>3.E.11  Instâncias (Igrejas)</w:t>
+        <w:t>3.E.11  Aliança Conecta Reino</w:t>
+      </w:r>
+    </w:p>
+    <w:p>
+      <w:pPr>
+        <w:spacing w:after="40" w:before="120"/>
+      </w:pPr>
+      <w:r>
+        <w:rPr>
+          <w:rFonts w:ascii="Calibri" w:hAnsi="Calibri" w:eastAsia="Calibri"/>
+          <w:b/>
+          <w:i w:val="0"/>
+          <w:color w:val="1E3A5F"/>
+          <w:sz w:val="22"/>
+        </w:rPr>
+        <w:t>Referência e nome da funcionalidade</w:t>
+      </w:r>
+    </w:p>
+    <w:p>
+      <w:pPr>
+        <w:spacing w:after="120" w:before="0" w:line="240" w:lineRule="auto"/>
+      </w:pPr>
+      <w:r>
+        <w:rPr>
+          <w:rFonts w:ascii="Calibri" w:hAnsi="Calibri" w:eastAsia="Calibri"/>
+          <w:b w:val="0"/>
+          <w:i w:val="0"/>
+          <w:sz w:val="22"/>
+        </w:rPr>
+        <w:t>Demonstrativo das assinaturas Conecta+ (cartão, baixa imediata) e do passivo de 40% às igrejas mães. A quitação da oferta de apoio ministerial é manual, em até 30 dias.</w:t>
+        <w:br/>
+        <w:t>Rota técnica: /alianca-conecta-reino  — hint: Indicações, passivo de 40% e baixa manual das ofertas</w:t>
+      </w:r>
+    </w:p>
+    <w:p>
+      <w:pPr>
+        <w:spacing w:after="40" w:before="120"/>
+      </w:pPr>
+      <w:r>
+        <w:rPr>
+          <w:rFonts w:ascii="Calibri" w:hAnsi="Calibri" w:eastAsia="Calibri"/>
+          <w:b/>
+          <w:i w:val="0"/>
+          <w:color w:val="1E3A5F"/>
+          <w:sz w:val="22"/>
+        </w:rPr>
+        <w:t>Quem acessa / visualiza</w:t>
+      </w:r>
+    </w:p>
+    <w:p>
+      <w:pPr>
+        <w:spacing w:after="120" w:before="0" w:line="240" w:lineRule="auto"/>
+      </w:pPr>
+      <w:r>
+        <w:rPr>
+          <w:rFonts w:ascii="Calibri" w:hAnsi="Calibri" w:eastAsia="Calibri"/>
+          <w:b w:val="0"/>
+          <w:i w:val="0"/>
+          <w:sz w:val="22"/>
+        </w:rPr>
+        <w:t>Somente Super Administrador. Tesoureiro e Secretaria não veem o item. A igreja mãe lê o recorte no boletim Financeiro (seção Aliança), sem baixar oferta.</w:t>
+      </w:r>
+    </w:p>
+    <w:p>
+      <w:pPr>
+        <w:spacing w:after="80" w:before="120" w:line="240" w:lineRule="auto"/>
+      </w:pPr>
+      <w:r>
+        <w:rPr>
+          <w:rFonts w:ascii="Calibri" w:hAnsi="Calibri" w:eastAsia="Calibri"/>
+          <w:b/>
+          <w:i w:val="0"/>
+          <w:color w:val="1E3A5F"/>
+          <w:sz w:val="22"/>
+        </w:rPr>
+        <w:t>Como acessar (passo a passo)</w:t>
+      </w:r>
+    </w:p>
+    <w:p>
+      <w:pPr>
+        <w:spacing w:after="80" w:before="0"/>
+        <w:ind w:left="283"/>
+      </w:pPr>
+      <w:r>
+        <w:rPr>
+          <w:rFonts w:ascii="Calibri" w:hAnsi="Calibri" w:eastAsia="Calibri"/>
+          <w:b/>
+          <w:i w:val="0"/>
+          <w:color w:val="0F4C81"/>
+          <w:sz w:val="22"/>
+        </w:rPr>
+        <w:t xml:space="preserve">1. </w:t>
+      </w:r>
+      <w:r>
+        <w:rPr>
+          <w:rFonts w:ascii="Calibri" w:hAnsi="Calibri" w:eastAsia="Calibri"/>
+          <w:b w:val="0"/>
+          <w:i w:val="0"/>
+          <w:sz w:val="22"/>
+        </w:rPr>
+        <w:t>Menu → engrenagem → Governança e TI → Aliança Conecta Reino (junto de Assinaturas, depois da Trilha).</w:t>
+      </w:r>
+    </w:p>
+    <w:p>
+      <w:pPr>
+        <w:spacing w:after="40" w:before="120"/>
+      </w:pPr>
+      <w:r>
+        <w:rPr>
+          <w:rFonts w:ascii="Calibri" w:hAnsi="Calibri" w:eastAsia="Calibri"/>
+          <w:b/>
+          <w:i w:val="0"/>
+          <w:color w:val="1E3A5F"/>
+          <w:sz w:val="22"/>
+        </w:rPr>
+        <w:t>Quem gerencia / cria / altera</w:t>
+      </w:r>
+    </w:p>
+    <w:p>
+      <w:pPr>
+        <w:spacing w:after="120" w:before="0" w:line="240" w:lineRule="auto"/>
+      </w:pPr>
+      <w:r>
+        <w:rPr>
+          <w:rFonts w:ascii="Calibri" w:hAnsi="Calibri" w:eastAsia="Calibri"/>
+          <w:b w:val="0"/>
+          <w:i w:val="0"/>
+          <w:sz w:val="22"/>
+        </w:rPr>
+        <w:t>Super Admin efetiva a oferta («Marcar como paga»). O Stripe baixa a assinatura do plano automaticamente; o passivo de 40% não se paga sozinho.</w:t>
+      </w:r>
+    </w:p>
+    <w:p>
+      <w:pPr>
+        <w:spacing w:after="40" w:before="120"/>
+      </w:pPr>
+      <w:r>
+        <w:rPr>
+          <w:rFonts w:ascii="Calibri" w:hAnsi="Calibri" w:eastAsia="Calibri"/>
+          <w:b/>
+          <w:i w:val="0"/>
+          <w:color w:val="1E3A5F"/>
+          <w:sz w:val="22"/>
+        </w:rPr>
+        <w:t>Permissão necessária (ACL)</w:t>
+      </w:r>
+    </w:p>
+    <w:p>
+      <w:pPr>
+        <w:spacing w:after="120" w:before="0" w:line="240" w:lineRule="auto"/>
+      </w:pPr>
+      <w:r>
+        <w:rPr>
+          <w:rFonts w:ascii="Calibri" w:hAnsi="Calibri" w:eastAsia="Calibri"/>
+          <w:b w:val="0"/>
+          <w:i w:val="0"/>
+          <w:sz w:val="22"/>
+        </w:rPr>
+        <w:t>Drawer `menu_alianca` só `isSuperAdmin`. RPCs `get_alianca_admin_statement`, `settle_alianca_payout_admin`. Webhook `process_alianca_invoice_paid` / `_failed`.</w:t>
+      </w:r>
+    </w:p>
+    <w:p>
+      <w:pPr>
+        <w:spacing w:after="80" w:before="120" w:line="240" w:lineRule="auto"/>
+      </w:pPr>
+      <w:r>
+        <w:rPr>
+          <w:rFonts w:ascii="Calibri" w:hAnsi="Calibri" w:eastAsia="Calibri"/>
+          <w:b/>
+          <w:i w:val="0"/>
+          <w:color w:val="1E3A5F"/>
+          <w:sz w:val="22"/>
+        </w:rPr>
+        <w:t>Como e quando preencher (guia prático)</w:t>
+      </w:r>
+    </w:p>
+    <w:p>
+      <w:pPr>
+        <w:spacing w:after="80" w:before="0"/>
+        <w:ind w:left="283"/>
+      </w:pPr>
+      <w:r>
+        <w:rPr>
+          <w:rFonts w:ascii="Calibri" w:hAnsi="Calibri" w:eastAsia="Calibri"/>
+          <w:b/>
+          <w:i w:val="0"/>
+          <w:color w:val="0F4C81"/>
+          <w:sz w:val="22"/>
+        </w:rPr>
+        <w:t xml:space="preserve">1. </w:t>
+      </w:r>
+      <w:r>
+        <w:rPr>
+          <w:rFonts w:ascii="Calibri" w:hAnsi="Calibri" w:eastAsia="Calibri"/>
+          <w:b w:val="0"/>
+          <w:i w:val="0"/>
+          <w:sz w:val="22"/>
+        </w:rPr>
+        <w:t>Abra o demonstrativo: assinaturas x passivo.</w:t>
+      </w:r>
+    </w:p>
+    <w:p>
+      <w:pPr>
+        <w:spacing w:after="80" w:before="0"/>
+        <w:ind w:left="283"/>
+      </w:pPr>
+      <w:r>
+        <w:rPr>
+          <w:rFonts w:ascii="Calibri" w:hAnsi="Calibri" w:eastAsia="Calibri"/>
+          <w:b/>
+          <w:i w:val="0"/>
+          <w:color w:val="0F4C81"/>
+          <w:sz w:val="22"/>
+        </w:rPr>
+        <w:t xml:space="preserve">2. </w:t>
+      </w:r>
+      <w:r>
+        <w:rPr>
+          <w:rFonts w:ascii="Calibri" w:hAnsi="Calibri" w:eastAsia="Calibri"/>
+          <w:b w:val="0"/>
+          <w:i w:val="0"/>
+          <w:sz w:val="22"/>
+        </w:rPr>
+        <w:t>Para quitar: confirme «Marcar como paga» (o diálogo vale também no navegador).</w:t>
+      </w:r>
+    </w:p>
+    <w:p>
+      <w:pPr>
+        <w:spacing w:after="80" w:before="0"/>
+        <w:ind w:left="283"/>
+      </w:pPr>
+      <w:r>
+        <w:rPr>
+          <w:rFonts w:ascii="Calibri" w:hAnsi="Calibri" w:eastAsia="Calibri"/>
+          <w:b/>
+          <w:i w:val="0"/>
+          <w:color w:val="0F4C81"/>
+          <w:sz w:val="22"/>
+        </w:rPr>
+        <w:t xml:space="preserve">3. </w:t>
+      </w:r>
+      <w:r>
+        <w:rPr>
+          <w:rFonts w:ascii="Calibri" w:hAnsi="Calibri" w:eastAsia="Calibri"/>
+          <w:b w:val="0"/>
+          <w:i w:val="0"/>
+          <w:sz w:val="22"/>
+        </w:rPr>
+        <w:t>Não misture com Informações Financeiras da tesouraria local — são camadas diferentes.</w:t>
+      </w:r>
+    </w:p>
+    <w:p>
+      <w:pPr>
+        <w:spacing w:after="80" w:before="0"/>
+        <w:ind w:left="283"/>
+      </w:pPr>
+      <w:r>
+        <w:rPr>
+          <w:rFonts w:ascii="Calibri" w:hAnsi="Calibri" w:eastAsia="Calibri"/>
+          <w:b/>
+          <w:i w:val="0"/>
+          <w:color w:val="0F4C81"/>
+          <w:sz w:val="22"/>
+        </w:rPr>
+        <w:t xml:space="preserve">4. </w:t>
+      </w:r>
+      <w:r>
+        <w:rPr>
+          <w:rFonts w:ascii="Calibri" w:hAnsi="Calibri" w:eastAsia="Calibri"/>
+          <w:b w:val="0"/>
+          <w:i w:val="0"/>
+          <w:sz w:val="22"/>
+        </w:rPr>
+        <w:t>O ciclo da parceria encerra no 4º pagamento conforme a regra da tela.</w:t>
+      </w:r>
+    </w:p>
+    <w:p>
+      <w:pPr>
+        <w:spacing w:before="160" w:after="40"/>
+      </w:pPr>
+      <w:r>
+        <w:rPr>
+          <w:rFonts w:ascii="Calibri" w:hAnsi="Calibri" w:eastAsia="Calibri"/>
+          <w:b/>
+          <w:i w:val="0"/>
+          <w:color w:val="8B1E1E"/>
+          <w:sz w:val="22"/>
+        </w:rPr>
+        <w:t>O que implica se não for preenchido a contento</w:t>
+      </w:r>
+    </w:p>
+    <w:p>
+      <w:pPr>
+        <w:spacing w:after="280" w:before="0" w:line="240" w:lineRule="auto"/>
+      </w:pPr>
+      <w:r>
+        <w:rPr>
+          <w:rFonts w:ascii="Calibri" w:hAnsi="Calibri" w:eastAsia="Calibri"/>
+          <w:b w:val="0"/>
+          <w:i w:val="0"/>
+          <w:sz w:val="22"/>
+        </w:rPr>
+        <w:t>Sem baixa manual: o passivo de 40% envelhece e a igreja mãe não recebe. Baixar a oferta errada: ciclo da parceria avança indevido. Sem Super Admin, a operação comercial da rede some do menu de propósito.</w:t>
+      </w:r>
+    </w:p>
+    <w:p>
+      <w:pPr>
+        <w:pStyle w:val="Heading2"/>
+      </w:pPr>
+      <w:r>
+        <w:rPr>
+          <w:rFonts w:ascii="Calibri" w:hAnsi="Calibri"/>
+          <w:color w:val="1E3A5F"/>
+        </w:rPr>
+        <w:t>3.E.12  Instâncias (Igrejas)</w:t>
       </w:r>
     </w:p>
     <w:p>
@@ -20744,7 +21861,7 @@
           <w:i w:val="0"/>
           <w:sz w:val="22"/>
         </w:rPr>
-        <w:t>Depois do culto: Presença se houver quórum. Régua de Acolhimento dos visitantes novos.</w:t>
+        <w:t>Depois do culto: Presença se houver quórum. Régua de Acolhimento dos visitantes novos. Empréstimos de livros: confirmar retiradas e WhatsApp de prazo.</w:t>
       </w:r>
     </w:p>
     <w:p>
@@ -20769,7 +21886,7 @@
           <w:i w:val="0"/>
           <w:sz w:val="22"/>
         </w:rPr>
-        <w:t>Nunca abra Cuidados Pastorais, Informações Financeiras, Ghost ou Assinaturas — não é o seu papel e o menu não mostra.</w:t>
+        <w:t>Nunca abra Cuidados Pastorais, Informações Financeiras, Ghost, Aliança ou Assinaturas — não é o seu papel e o menu não mostra.</w:t>
       </w:r>
     </w:p>
     <w:p>
@@ -20906,6 +22023,62 @@
           <w:sz w:val="22"/>
         </w:rPr>
         <w:t>app/maintenance-dashboard.tsx — painéis da engrenagem.</w:t>
+      </w:r>
+    </w:p>
+    <w:p>
+      <w:pPr>
+        <w:pStyle w:val="ListBullet"/>
+      </w:pPr>
+      <w:r>
+        <w:rPr>
+          <w:rFonts w:ascii="Calibri" w:hAnsi="Calibri" w:eastAsia="Calibri"/>
+          <w:b w:val="0"/>
+          <w:i w:val="0"/>
+          <w:sz w:val="22"/>
+        </w:rPr>
+        <w:t>app/sobre-conecta.tsx e lib/conectaPrivacyDeclaration.ts — declaração LGPD de consulta.</w:t>
+      </w:r>
+    </w:p>
+    <w:p>
+      <w:pPr>
+        <w:pStyle w:val="ListBullet"/>
+      </w:pPr>
+      <w:r>
+        <w:rPr>
+          <w:rFonts w:ascii="Calibri" w:hAnsi="Calibri" w:eastAsia="Calibri"/>
+          <w:b w:val="0"/>
+          <w:i w:val="0"/>
+          <w:sz w:val="22"/>
+        </w:rPr>
+        <w:t>app/livros-doados.tsx, components/LivrosDoadosPanel.tsx, LivrosEmprestimosPanel.tsx, MeusLivrosRetiradosPanel.tsx — acervo e empréstimos.</w:t>
+      </w:r>
+    </w:p>
+    <w:p>
+      <w:pPr>
+        <w:pStyle w:val="ListBullet"/>
+      </w:pPr>
+      <w:r>
+        <w:rPr>
+          <w:rFonts w:ascii="Calibri" w:hAnsi="Calibri" w:eastAsia="Calibri"/>
+          <w:b w:val="0"/>
+          <w:i w:val="0"/>
+          <w:sz w:val="22"/>
+        </w:rPr>
+        <w:t>lib/isbnCatalogLookup.ts e functions/api/buscar-livro.ts — Google Books, CBL/BrasilAPI, Open Library.</w:t>
+      </w:r>
+    </w:p>
+    <w:p>
+      <w:pPr>
+        <w:pStyle w:val="ListBullet"/>
+      </w:pPr>
+      <w:r>
+        <w:rPr>
+          <w:rFonts w:ascii="Calibri" w:hAnsi="Calibri" w:eastAsia="Calibri"/>
+          <w:b w:val="0"/>
+          <w:i w:val="0"/>
+          <w:sz w:val="22"/>
+        </w:rPr>
+        <w:t>app/alianca-conecta-reino.tsx e lib/alianca/ — passivo 40% e baixa manual.</w:t>
       </w:r>
     </w:p>
     <w:p>

</xml_diff>